<commit_message>
feat: fill certificate issue time placeholder
</commit_message>
<xml_diff>
--- a/templates/qualification_certificate.docx
+++ b/templates/qualification_certificate.docx
@@ -40,7 +40,6 @@
             <w:insideH w:val="none" w:color="auto" w:sz="0" w:space="0"/>
             <w:insideV w:val="none" w:color="auto" w:sz="0" w:space="0"/>
           </w:tblBorders>
-          <w:shd w:val="clear" w:color="auto" w:fill="auto"/>
           <w:tblCellMar>
             <w:top w:w="0" w:type="dxa"/>
             <w:left w:w="108" w:type="dxa"/>
@@ -193,6 +192,7 @@
             <w:insideH w:val="none" w:color="auto" w:sz="0" w:space="0"/>
             <w:insideV w:val="none" w:color="auto" w:sz="0" w:space="0"/>
           </w:tblBorders>
+          <w:shd w:val="clear" w:color="auto" w:fill="auto"/>
           <w:tblCellMar>
             <w:top w:w="0" w:type="dxa"/>
             <w:left w:w="108" w:type="dxa"/>
@@ -363,6 +363,7 @@
             <w:insideH w:val="none" w:color="auto" w:sz="0" w:space="0"/>
             <w:insideV w:val="none" w:color="auto" w:sz="0" w:space="0"/>
           </w:tblBorders>
+          <w:shd w:val="clear" w:color="auto" w:fill="auto"/>
           <w:tblCellMar>
             <w:top w:w="0" w:type="dxa"/>
             <w:left w:w="108" w:type="dxa"/>
@@ -673,6 +674,7 @@
             <w:insideH w:val="none" w:color="auto" w:sz="0" w:space="0"/>
             <w:insideV w:val="none" w:color="auto" w:sz="0" w:space="0"/>
           </w:tblBorders>
+          <w:shd w:val="clear" w:color="auto" w:fill="auto"/>
           <w:tblCellMar>
             <w:top w:w="0" w:type="dxa"/>
             <w:left w:w="108" w:type="dxa"/>
@@ -731,26 +733,8 @@
                 <w:u w:val="none"/>
                 <w:lang w:val="en-US" w:eastAsia="zh-CN" w:bidi="ar"/>
               </w:rPr>
-              <w:t>证件作业项：</w:t>
+              <w:t>证件作业项：&lt;zjzyx&gt;</w:t>
             </w:r>
-            <w:bookmarkStart w:id="0" w:name="_GoBack"/>
-            <w:r>
-              <w:rPr>
-                <w:rFonts w:hint="eastAsia" w:ascii="等线" w:hAnsi="等线" w:eastAsia="等线" w:cs="等线"/>
-                <w:b/>
-                <w:bCs/>
-                <w:i w:val="0"/>
-                <w:iCs w:val="0"/>
-                <w:color w:val="000000"/>
-                <w:kern w:val="0"/>
-                <w:sz w:val="18"/>
-                <w:szCs w:val="18"/>
-                <w:u w:val="none"/>
-                <w:lang w:val="en-US" w:eastAsia="zh-CN" w:bidi="ar"/>
-              </w:rPr>
-              <w:t>&lt;zjzyx&gt;</w:t>
-            </w:r>
-            <w:bookmarkEnd w:id="0"/>
           </w:p>
         </w:tc>
         <w:tc>
@@ -907,6 +891,24 @@
               </w:rPr>
               <w:t>签发时间：</w:t>
             </w:r>
+            <w:bookmarkStart w:id="0" w:name="_GoBack"/>
+            <w:r>
+              <w:rPr>
+                <w:rFonts w:hint="eastAsia" w:ascii="等线" w:hAnsi="等线" w:eastAsia="等线" w:cs="等线"/>
+                <w:b/>
+                <w:bCs/>
+                <w:i w:val="0"/>
+                <w:iCs w:val="0"/>
+                <w:color w:val="000000"/>
+                <w:kern w:val="0"/>
+                <w:sz w:val="18"/>
+                <w:szCs w:val="18"/>
+                <w:u w:val="none"/>
+                <w:lang w:val="en-US" w:eastAsia="zh-CN" w:bidi="ar"/>
+              </w:rPr>
+              <w:t>&lt;time&gt;</w:t>
+            </w:r>
+            <w:bookmarkEnd w:id="0"/>
           </w:p>
         </w:tc>
       </w:tr>

</xml_diff>